<commit_message>
Refine leave display hierarchy and reports menu
</commit_message>
<xml_diff>
--- a/modules/LeaveManagement/Templates/report-templates/Mau 01_Bao cao QN da nghi phep_Dien Quan luc QL.docx
+++ b/modules/LeaveManagement/Templates/report-templates/Mau 01_Bao cao QN da nghi phep_Dien Quan luc QL.docx
@@ -4,51 +4,61 @@
   <w:body>
     <w:tbl>
       <w:tblGrid>
-        <w:gridCol w:w="6200" w:type="dxa"/>
-        <w:gridCol w:w="7800" w:type="dxa"/>
+        <w:gridCol w:w="7029.92125984252" w:type="dxa"/>
+        <w:gridCol w:w="7370.07874015748" w:type="dxa"/>
       </w:tblGrid>
       <w:tblPr>
         <w:tblW w:w="0" w:type="auto"/>
         <w:tblLayout w:type="autofit"/>
         <w:tblCellMar>
-          <w:top w:w="40" w:type="dxa"/>
-          <w:left w:w="40" w:type="dxa"/>
-          <w:right w:w="40" w:type="dxa"/>
-          <w:bottom w:w="40" w:type="dxa"/>
+          <w:top w:w="0" w:type="dxa"/>
+          <w:left w:w="0" w:type="dxa"/>
+          <w:right w:w="0" w:type="dxa"/>
+          <w:bottom w:w="0" w:type="dxa"/>
         </w:tblCellMar>
         <w:tblBorders>
-          <w:top w:val="single" w:sz="0" w:color="FFFFFF"/>
-          <w:left w:val="single" w:sz="0" w:color="FFFFFF"/>
-          <w:right w:val="single" w:sz="0" w:color="FFFFFF"/>
-          <w:bottom w:val="single" w:sz="0" w:color="FFFFFF"/>
-          <w:insideH w:val="single" w:sz="0" w:color="FFFFFF"/>
-          <w:insideV w:val="single" w:sz="0" w:color="FFFFFF"/>
+          <w:top w:val="single" w:sz="0"/>
+          <w:left w:val="single" w:sz="0"/>
+          <w:right w:val="single" w:sz="0"/>
+          <w:bottom w:val="single" w:sz="0"/>
+          <w:insideH w:val="single" w:sz="0"/>
+          <w:insideV w:val="single" w:sz="0"/>
         </w:tblBorders>
       </w:tblPr>
       <w:tr>
         <w:trPr/>
         <w:tc>
           <w:tcPr>
-            <w:tcW w:w="6200" w:type="dxa"/>
-            <w:noWrap/>
-          </w:tcPr>
-          <w:p>
-            <w:pPr>
-              <w:jc w:val="center"/>
-            </w:pPr>
-            <w:r>
-              <w:rPr/>
-              <w:t xml:space="preserve">TỔNG CỤC HẬU CẦN KỸ THUẬT</w:t>
-            </w:r>
-          </w:p>
-          <w:p>
-            <w:pPr>
-              <w:jc w:val="center"/>
-            </w:pPr>
-            <w:r>
-              <w:rPr>
-                <w:b w:val="1"/>
-                <w:bCs w:val="1"/>
+            <w:tcW w:w="7029.92125984252" w:type="dxa"/>
+            <w:noWrap/>
+          </w:tcPr>
+          <w:p>
+            <w:pPr>
+              <w:jc w:val="center"/>
+              <w:spacing w:after="0"/>
+            </w:pPr>
+            <w:r>
+              <w:rPr>
+                <w:sz w:val="24"/>
+                <w:szCs w:val="24"/>
+                <w:b w:val="1"/>
+                <w:bCs w:val="1"/>
+              </w:rPr>
+              <w:t xml:space="preserve">TỔNG CỤC HẬU CẦN - KỸ THUẬT</w:t>
+            </w:r>
+          </w:p>
+          <w:p>
+            <w:pPr>
+              <w:jc w:val="center"/>
+              <w:spacing w:after="0"/>
+            </w:pPr>
+            <w:r>
+              <w:rPr>
+                <w:sz w:val="24"/>
+                <w:szCs w:val="24"/>
+                <w:b w:val="1"/>
+                <w:bCs w:val="1"/>
+                <w:u w:val="single"/>
               </w:rPr>
               <w:t xml:space="preserve">TRƯỜNG CAO ĐẲNG HẬU CẦN 2</w:t>
             </w:r>
@@ -56,15 +66,18 @@
         </w:tc>
         <w:tc>
           <w:tcPr>
-            <w:tcW w:w="7800" w:type="dxa"/>
-            <w:noWrap/>
-          </w:tcPr>
-          <w:p>
-            <w:pPr>
-              <w:jc w:val="center"/>
-            </w:pPr>
-            <w:r>
-              <w:rPr>
+            <w:tcW w:w="7370.07874015748" w:type="dxa"/>
+            <w:noWrap/>
+          </w:tcPr>
+          <w:p>
+            <w:pPr>
+              <w:jc w:val="center"/>
+              <w:spacing w:after="0"/>
+            </w:pPr>
+            <w:r>
+              <w:rPr>
+                <w:sz w:val="24"/>
+                <w:szCs w:val="24"/>
                 <w:b w:val="1"/>
                 <w:bCs w:val="1"/>
               </w:rPr>
@@ -74,25 +87,17 @@
           <w:p>
             <w:pPr>
               <w:jc w:val="center"/>
-            </w:pPr>
-            <w:r>
-              <w:rPr>
-                <w:b w:val="1"/>
-                <w:bCs w:val="1"/>
+              <w:spacing w:after="0"/>
+            </w:pPr>
+            <w:r>
+              <w:rPr>
+                <w:sz w:val="24"/>
+                <w:szCs w:val="24"/>
+                <w:b w:val="1"/>
+                <w:bCs w:val="1"/>
+                <w:u w:val="single"/>
               </w:rPr>
               <w:t xml:space="preserve">Độc lập - Tự do - Hạnh phúc</w:t>
-            </w:r>
-          </w:p>
-          <w:p>
-            <w:pPr>
-              <w:jc w:val="center"/>
-            </w:pPr>
-            <w:r>
-              <w:rPr>
-                <w:i w:val="1"/>
-                <w:iCs w:val="1"/>
-              </w:rPr>
-              <w:t xml:space="preserve">Thành phố Hồ Chí Minh, ngày ${ngay} tháng ${thang} năm ${nam_hien_tai}</w:t>
             </w:r>
           </w:p>
         </w:tc>
@@ -101,12 +106,64 @@
     <w:p/>
     <w:p>
       <w:pPr>
-        <w:jc w:val="center"/>
+        <w:jc w:val="right"/>
+        <w:spacing w:after="160"/>
       </w:pPr>
       <w:r>
         <w:rPr>
-          <w:sz w:val="26"/>
-          <w:szCs w:val="26"/>
+          <w:i w:val="1"/>
+          <w:iCs w:val="1"/>
+        </w:rPr>
+        <w:t xml:space="preserve">Thành Phố Hồ Chí Minh, ngày </w:t>
+      </w:r>
+      <w:r>
+        <w:rPr>
+          <w:i w:val="1"/>
+          <w:iCs w:val="1"/>
+          <w:u w:val="single"/>
+        </w:rPr>
+        <w:t xml:space="preserve">${ngay}</w:t>
+      </w:r>
+      <w:r>
+        <w:rPr>
+          <w:i w:val="1"/>
+          <w:iCs w:val="1"/>
+        </w:rPr>
+        <w:t xml:space="preserve"> tháng </w:t>
+      </w:r>
+      <w:r>
+        <w:rPr>
+          <w:i w:val="1"/>
+          <w:iCs w:val="1"/>
+          <w:u w:val="single"/>
+        </w:rPr>
+        <w:t xml:space="preserve">${thang}</w:t>
+      </w:r>
+      <w:r>
+        <w:rPr>
+          <w:i w:val="1"/>
+          <w:iCs w:val="1"/>
+        </w:rPr>
+        <w:t xml:space="preserve"> năm </w:t>
+      </w:r>
+      <w:r>
+        <w:rPr>
+          <w:i w:val="1"/>
+          <w:iCs w:val="1"/>
+          <w:u w:val="single"/>
+        </w:rPr>
+        <w:t xml:space="preserve">${nam_hien_tai}</w:t>
+      </w:r>
+    </w:p>
+    <w:p>
+      <w:pPr>
+        <w:jc w:val="center"/>
+        <w:spacing w:after="0"/>
+      </w:pPr>
+      <w:r>
+        <w:rPr>
+          <w:sz w:val="28"/>
+          <w:szCs w:val="28"/>
           <w:b w:val="1"/>
           <w:bCs w:val="1"/>
         </w:rPr>
@@ -116,6 +173,7 @@
     <w:p>
       <w:pPr>
         <w:jc w:val="center"/>
+        <w:spacing w:after="0"/>
       </w:pPr>
       <w:r>
         <w:rPr>
@@ -130,33 +188,32 @@
     <w:p>
       <w:pPr>
         <w:jc w:val="center"/>
+        <w:spacing w:after="120"/>
       </w:pPr>
       <w:r>
         <w:rPr>
-          <w:sz w:val="26"/>
-          <w:szCs w:val="26"/>
-          <w:b w:val="1"/>
-          <w:bCs w:val="1"/>
+          <w:i w:val="1"/>
+          <w:iCs w:val="1"/>
+          <w:u w:val="single"/>
         </w:rPr>
         <w:t xml:space="preserve">(Diện Quân lực quản lý)</w:t>
       </w:r>
     </w:p>
-    <w:p/>
     <w:tbl>
       <w:tblGrid>
-        <w:gridCol w:w="1500" w:type="dxa"/>
-        <w:gridCol w:w="1500" w:type="dxa"/>
-        <w:gridCol w:w="1500" w:type="dxa"/>
-        <w:gridCol w:w="1500" w:type="dxa"/>
-        <w:gridCol w:w="1500" w:type="dxa"/>
-        <w:gridCol w:w="1500" w:type="dxa"/>
-        <w:gridCol w:w="1500" w:type="dxa"/>
-        <w:gridCol w:w="1500" w:type="dxa"/>
+        <w:gridCol/>
+        <w:gridCol/>
+        <w:gridCol/>
+        <w:gridCol/>
+        <w:gridCol w:w="1360.6299212598426" w:type="dxa"/>
+        <w:gridCol w:w="1360.6299212598426" w:type="dxa"/>
+        <w:gridCol w:w="1870.8661417322833" w:type="dxa"/>
+        <w:gridCol/>
       </w:tblGrid>
       <w:tblPr>
         <w:jc w:val="center"/>
         <w:tblW w:w="0" w:type="auto"/>
-        <w:tblLayout w:type="autofit"/>
+        <w:tblLayout w:type="fixed"/>
         <w:tblCellMar>
           <w:top w:w="70" w:type="dxa"/>
           <w:left w:w="70" w:type="dxa"/>
@@ -173,21 +230,26 @@
         </w:tblBorders>
       </w:tblPr>
       <w:tr>
-        <w:trPr/>
-        <w:tc>
-          <w:tcPr>
-            <w:tcW w:w="1500" w:type="dxa"/>
-            <w:vAlign w:val="center"/>
-            <w:noWrap/>
-          </w:tcPr>
-          <w:p>
-            <w:pPr>
-              <w:jc w:val="center"/>
-            </w:pPr>
-            <w:r>
-              <w:rPr>
-                <w:sz w:val="24"/>
-                <w:szCs w:val="24"/>
+        <w:trPr>
+          <w:trHeight w:val="396.8503937007873" w:hRule="atLeast"/>
+        </w:trPr>
+        <w:tc>
+          <w:tcPr>
+            <w:tcW w:w="566.9291338582676" w:type="dxa"/>
+            <w:vAlign w:val="center"/>
+            <w:shd w:val="clear" w:fill="F2F2F2"/>
+            <w:vMerge w:val="restart"/>
+            <w:noWrap/>
+          </w:tcPr>
+          <w:p>
+            <w:pPr>
+              <w:jc w:val="center"/>
+              <w:spacing w:after="0"/>
+            </w:pPr>
+            <w:r>
+              <w:rPr>
+                <w:sz w:val="22"/>
+                <w:szCs w:val="22"/>
                 <w:b w:val="1"/>
                 <w:bCs w:val="1"/>
               </w:rPr>
@@ -197,18 +259,21 @@
         </w:tc>
         <w:tc>
           <w:tcPr>
-            <w:tcW w:w="1500" w:type="dxa"/>
-            <w:vAlign w:val="center"/>
-            <w:noWrap/>
-          </w:tcPr>
-          <w:p>
-            <w:pPr>
-              <w:jc w:val="center"/>
-            </w:pPr>
-            <w:r>
-              <w:rPr>
-                <w:sz w:val="24"/>
-                <w:szCs w:val="24"/>
+            <w:tcW w:w="2607.8740157480315" w:type="dxa"/>
+            <w:vAlign w:val="center"/>
+            <w:shd w:val="clear" w:fill="F2F2F2"/>
+            <w:vMerge w:val="restart"/>
+            <w:noWrap/>
+          </w:tcPr>
+          <w:p>
+            <w:pPr>
+              <w:jc w:val="center"/>
+              <w:spacing w:after="0"/>
+            </w:pPr>
+            <w:r>
+              <w:rPr>
+                <w:sz w:val="22"/>
+                <w:szCs w:val="22"/>
                 <w:b w:val="1"/>
                 <w:bCs w:val="1"/>
               </w:rPr>
@@ -218,18 +283,21 @@
         </w:tc>
         <w:tc>
           <w:tcPr>
-            <w:tcW w:w="1500" w:type="dxa"/>
-            <w:vAlign w:val="center"/>
-            <w:noWrap/>
-          </w:tcPr>
-          <w:p>
-            <w:pPr>
-              <w:jc w:val="center"/>
-            </w:pPr>
-            <w:r>
-              <w:rPr>
-                <w:sz w:val="24"/>
-                <w:szCs w:val="24"/>
+            <w:tcW w:w="1247.244094488189" w:type="dxa"/>
+            <w:vAlign w:val="center"/>
+            <w:shd w:val="clear" w:fill="F2F2F2"/>
+            <w:vMerge w:val="restart"/>
+            <w:noWrap/>
+          </w:tcPr>
+          <w:p>
+            <w:pPr>
+              <w:jc w:val="center"/>
+              <w:spacing w:after="0"/>
+            </w:pPr>
+            <w:r>
+              <w:rPr>
+                <w:sz w:val="22"/>
+                <w:szCs w:val="22"/>
                 <w:b w:val="1"/>
                 <w:bCs w:val="1"/>
               </w:rPr>
@@ -239,18 +307,21 @@
         </w:tc>
         <w:tc>
           <w:tcPr>
-            <w:tcW w:w="1500" w:type="dxa"/>
-            <w:vAlign w:val="center"/>
-            <w:noWrap/>
-          </w:tcPr>
-          <w:p>
-            <w:pPr>
-              <w:jc w:val="center"/>
-            </w:pPr>
-            <w:r>
-              <w:rPr>
-                <w:sz w:val="24"/>
-                <w:szCs w:val="24"/>
+            <w:tcW w:w="1190.551181102362" w:type="dxa"/>
+            <w:vAlign w:val="center"/>
+            <w:shd w:val="clear" w:fill="F2F2F2"/>
+            <w:vMerge w:val="restart"/>
+            <w:noWrap/>
+          </w:tcPr>
+          <w:p>
+            <w:pPr>
+              <w:jc w:val="center"/>
+              <w:spacing w:after="0"/>
+            </w:pPr>
+            <w:r>
+              <w:rPr>
+                <w:sz w:val="22"/>
+                <w:szCs w:val="22"/>
                 <w:b w:val="1"/>
                 <w:bCs w:val="1"/>
               </w:rPr>
@@ -260,81 +331,45 @@
         </w:tc>
         <w:tc>
           <w:tcPr>
-            <w:tcW w:w="1500" w:type="dxa"/>
-            <w:vAlign w:val="center"/>
-            <w:noWrap/>
-          </w:tcPr>
-          <w:p>
-            <w:pPr>
-              <w:jc w:val="center"/>
-            </w:pPr>
-            <w:r>
-              <w:rPr>
-                <w:sz w:val="24"/>
-                <w:szCs w:val="24"/>
-                <w:b w:val="1"/>
-                <w:bCs w:val="1"/>
-              </w:rPr>
-              <w:t xml:space="preserve">Từ ngày</w:t>
-            </w:r>
-          </w:p>
-        </w:tc>
-        <w:tc>
-          <w:tcPr>
-            <w:tcW w:w="1500" w:type="dxa"/>
-            <w:vAlign w:val="center"/>
-            <w:noWrap/>
-          </w:tcPr>
-          <w:p>
-            <w:pPr>
-              <w:jc w:val="center"/>
-            </w:pPr>
-            <w:r>
-              <w:rPr>
-                <w:sz w:val="24"/>
-                <w:szCs w:val="24"/>
-                <w:b w:val="1"/>
-                <w:bCs w:val="1"/>
-              </w:rPr>
-              <w:t xml:space="preserve">Đến ngày</w:t>
-            </w:r>
-          </w:p>
-        </w:tc>
-        <w:tc>
-          <w:tcPr>
-            <w:tcW w:w="1500" w:type="dxa"/>
-            <w:vAlign w:val="center"/>
-            <w:noWrap/>
-          </w:tcPr>
-          <w:p>
-            <w:pPr>
-              <w:jc w:val="center"/>
-            </w:pPr>
-            <w:r>
-              <w:rPr>
-                <w:sz w:val="24"/>
-                <w:szCs w:val="24"/>
-                <w:b w:val="1"/>
-                <w:bCs w:val="1"/>
-              </w:rPr>
-              <w:t xml:space="preserve">Nơi nghỉ phép</w:t>
-            </w:r>
-          </w:p>
-        </w:tc>
-        <w:tc>
-          <w:tcPr>
-            <w:tcW w:w="1500" w:type="dxa"/>
-            <w:vAlign w:val="center"/>
-            <w:noWrap/>
-          </w:tcPr>
-          <w:p>
-            <w:pPr>
-              <w:jc w:val="center"/>
-            </w:pPr>
-            <w:r>
-              <w:rPr>
-                <w:sz w:val="24"/>
-                <w:szCs w:val="24"/>
+            <w:tcW w:w="4592.1259842519685" w:type="dxa"/>
+            <w:vAlign w:val="center"/>
+            <w:shd w:val="clear" w:fill="F2F2F2"/>
+            <w:gridSpan w:val="3"/>
+            <w:noWrap/>
+          </w:tcPr>
+          <w:p>
+            <w:pPr>
+              <w:jc w:val="center"/>
+              <w:spacing w:after="0"/>
+            </w:pPr>
+            <w:r>
+              <w:rPr>
+                <w:sz w:val="22"/>
+                <w:szCs w:val="22"/>
+                <w:b w:val="1"/>
+                <w:bCs w:val="1"/>
+              </w:rPr>
+              <w:t xml:space="preserve">Đã nghỉ phép</w:t>
+            </w:r>
+          </w:p>
+        </w:tc>
+        <w:tc>
+          <w:tcPr>
+            <w:tcW w:w="1814.1732283464567" w:type="dxa"/>
+            <w:vAlign w:val="center"/>
+            <w:shd w:val="clear" w:fill="F2F2F2"/>
+            <w:vMerge w:val="restart"/>
+            <w:noWrap/>
+          </w:tcPr>
+          <w:p>
+            <w:pPr>
+              <w:jc w:val="center"/>
+              <w:spacing w:after="0"/>
+            </w:pPr>
+            <w:r>
+              <w:rPr>
+                <w:sz w:val="22"/>
+                <w:szCs w:val="22"/>
                 <w:b w:val="1"/>
                 <w:bCs w:val="1"/>
               </w:rPr>
@@ -344,182 +379,463 @@
         </w:tc>
       </w:tr>
       <w:tr>
-        <w:trPr/>
-        <w:tc>
-          <w:tcPr>
-            <w:tcW w:w="1500" w:type="dxa"/>
-            <w:vAlign w:val="center"/>
-            <w:noWrap/>
-          </w:tcPr>
-          <w:p>
-            <w:pPr>
-              <w:jc w:val="center"/>
-            </w:pPr>
-            <w:r>
-              <w:rPr/>
+        <w:trPr>
+          <w:trHeight w:val="396.8503937007873" w:hRule="atLeast"/>
+        </w:trPr>
+        <w:tc>
+          <w:tcPr>
+            <w:vAlign w:val="center"/>
+            <w:shd w:val="clear" w:fill="F2F2F2"/>
+            <w:vMerge w:val="continue"/>
+            <w:noWrap/>
+          </w:tcPr>
+          <w:p/>
+        </w:tc>
+        <w:tc>
+          <w:tcPr>
+            <w:vAlign w:val="center"/>
+            <w:shd w:val="clear" w:fill="F2F2F2"/>
+            <w:vMerge w:val="continue"/>
+            <w:noWrap/>
+          </w:tcPr>
+          <w:p/>
+        </w:tc>
+        <w:tc>
+          <w:tcPr>
+            <w:vAlign w:val="center"/>
+            <w:shd w:val="clear" w:fill="F2F2F2"/>
+            <w:vMerge w:val="continue"/>
+            <w:noWrap/>
+          </w:tcPr>
+          <w:p/>
+        </w:tc>
+        <w:tc>
+          <w:tcPr>
+            <w:vAlign w:val="center"/>
+            <w:shd w:val="clear" w:fill="F2F2F2"/>
+            <w:vMerge w:val="continue"/>
+            <w:noWrap/>
+          </w:tcPr>
+          <w:p/>
+        </w:tc>
+        <w:tc>
+          <w:tcPr>
+            <w:tcW w:w="1360.6299212598426" w:type="dxa"/>
+            <w:vAlign w:val="center"/>
+            <w:shd w:val="clear" w:fill="F2F2F2"/>
+            <w:noWrap/>
+          </w:tcPr>
+          <w:p>
+            <w:pPr>
+              <w:jc w:val="center"/>
+              <w:spacing w:after="0"/>
+            </w:pPr>
+            <w:r>
+              <w:rPr>
+                <w:sz w:val="22"/>
+                <w:szCs w:val="22"/>
+                <w:b w:val="1"/>
+                <w:bCs w:val="1"/>
+              </w:rPr>
+              <w:t xml:space="preserve">Từ ngày</w:t>
+            </w:r>
+          </w:p>
+        </w:tc>
+        <w:tc>
+          <w:tcPr>
+            <w:tcW w:w="1360.6299212598426" w:type="dxa"/>
+            <w:vAlign w:val="center"/>
+            <w:shd w:val="clear" w:fill="F2F2F2"/>
+            <w:noWrap/>
+          </w:tcPr>
+          <w:p>
+            <w:pPr>
+              <w:jc w:val="center"/>
+              <w:spacing w:after="0"/>
+            </w:pPr>
+            <w:r>
+              <w:rPr>
+                <w:sz w:val="22"/>
+                <w:szCs w:val="22"/>
+                <w:b w:val="1"/>
+                <w:bCs w:val="1"/>
+              </w:rPr>
+              <w:t xml:space="preserve">Đến ngày</w:t>
+            </w:r>
+          </w:p>
+        </w:tc>
+        <w:tc>
+          <w:tcPr>
+            <w:tcW w:w="1870.8661417322833" w:type="dxa"/>
+            <w:vAlign w:val="center"/>
+            <w:shd w:val="clear" w:fill="F2F2F2"/>
+            <w:noWrap/>
+          </w:tcPr>
+          <w:p>
+            <w:pPr>
+              <w:jc w:val="center"/>
+              <w:spacing w:after="0"/>
+            </w:pPr>
+            <w:r>
+              <w:rPr>
+                <w:sz w:val="22"/>
+                <w:szCs w:val="22"/>
+                <w:b w:val="1"/>
+                <w:bCs w:val="1"/>
+              </w:rPr>
+              <w:t xml:space="preserve">Nơi nghỉ phép</w:t>
+            </w:r>
+          </w:p>
+        </w:tc>
+        <w:tc>
+          <w:tcPr>
+            <w:vAlign w:val="center"/>
+            <w:shd w:val="clear" w:fill="F2F2F2"/>
+            <w:vMerge w:val="continue"/>
+            <w:noWrap/>
+          </w:tcPr>
+          <w:p/>
+        </w:tc>
+      </w:tr>
+      <w:tr>
+        <w:trPr>
+          <w:trHeight w:val="396.8503937007873" w:hRule="atLeast"/>
+        </w:trPr>
+        <w:tc>
+          <w:tcPr>
+            <w:tcW w:w="566.9291338582676" w:type="dxa"/>
+          </w:tcPr>
+          <w:p>
+            <w:pPr>
+              <w:jc w:val="center"/>
+              <w:spacing w:after="0"/>
+            </w:pPr>
+            <w:r>
+              <w:rPr>
+                <w:sz w:val="24"/>
+                <w:szCs w:val="24"/>
+              </w:rPr>
+              <w:t xml:space="preserve"/>
+            </w:r>
+          </w:p>
+        </w:tc>
+        <w:tc>
+          <w:tcPr>
+            <w:tcW w:w="2607.8740157480315" w:type="dxa"/>
+          </w:tcPr>
+          <w:p>
+            <w:pPr>
+              <w:spacing w:after="0"/>
+            </w:pPr>
+            <w:r>
+              <w:rPr>
+                <w:sz w:val="24"/>
+                <w:szCs w:val="24"/>
+                <w:bCs w:val="1"/>
+              </w:rPr>
+              <w:t xml:space="preserve">${don_vi_quan_nhan}</w:t>
+            </w:r>
+          </w:p>
+        </w:tc>
+        <w:tc>
+          <w:tcPr>
+            <w:tcW w:w="1247.244094488189" w:type="dxa"/>
+          </w:tcPr>
+          <w:p>
+            <w:pPr>
+              <w:jc w:val="center"/>
+              <w:spacing w:after="0"/>
+            </w:pPr>
+            <w:r>
+              <w:rPr>
+                <w:sz w:val="24"/>
+                <w:szCs w:val="24"/>
+              </w:rPr>
+              <w:t xml:space="preserve"/>
+            </w:r>
+          </w:p>
+        </w:tc>
+        <w:tc>
+          <w:tcPr>
+            <w:tcW w:w="1190.551181102362" w:type="dxa"/>
+          </w:tcPr>
+          <w:p>
+            <w:pPr>
+              <w:jc w:val="center"/>
+              <w:spacing w:after="0"/>
+            </w:pPr>
+            <w:r>
+              <w:rPr>
+                <w:sz w:val="24"/>
+                <w:szCs w:val="24"/>
+              </w:rPr>
+              <w:t xml:space="preserve"/>
+            </w:r>
+          </w:p>
+        </w:tc>
+        <w:tc>
+          <w:tcPr/>
+          <w:p>
+            <w:pPr>
+              <w:jc w:val="center"/>
+              <w:spacing w:after="0"/>
+            </w:pPr>
+            <w:r>
+              <w:rPr>
+                <w:sz w:val="24"/>
+                <w:szCs w:val="24"/>
+              </w:rPr>
+              <w:t xml:space="preserve"/>
+            </w:r>
+          </w:p>
+        </w:tc>
+        <w:tc>
+          <w:tcPr/>
+          <w:p>
+            <w:pPr>
+              <w:jc w:val="center"/>
+              <w:spacing w:after="0"/>
+            </w:pPr>
+            <w:r>
+              <w:rPr>
+                <w:sz w:val="24"/>
+                <w:szCs w:val="24"/>
+              </w:rPr>
+              <w:t xml:space="preserve"/>
+            </w:r>
+          </w:p>
+        </w:tc>
+        <w:tc>
+          <w:tcPr/>
+          <w:p>
+            <w:pPr>
+              <w:jc w:val="center"/>
+              <w:spacing w:after="0"/>
+            </w:pPr>
+            <w:r>
+              <w:rPr>
+                <w:sz w:val="24"/>
+                <w:szCs w:val="24"/>
+              </w:rPr>
+              <w:t xml:space="preserve"/>
+            </w:r>
+          </w:p>
+        </w:tc>
+        <w:tc>
+          <w:tcPr/>
+          <w:p>
+            <w:pPr>
+              <w:jc w:val="center"/>
+              <w:spacing w:after="0"/>
+            </w:pPr>
+            <w:r>
+              <w:rPr>
+                <w:sz w:val="24"/>
+                <w:szCs w:val="24"/>
+              </w:rPr>
+              <w:t xml:space="preserve"/>
+            </w:r>
+          </w:p>
+        </w:tc>
+      </w:tr>
+      <w:tr>
+        <w:trPr>
+          <w:trHeight w:val="396.8503937007873" w:hRule="atLeast"/>
+        </w:trPr>
+        <w:tc>
+          <w:tcPr>
+            <w:tcW w:w="566.9291338582676" w:type="dxa"/>
+            <w:noWrap/>
+          </w:tcPr>
+          <w:p>
+            <w:pPr>
+              <w:jc w:val="center"/>
+              <w:spacing w:after="0"/>
+            </w:pPr>
+            <w:r>
+              <w:rPr>
+                <w:sz w:val="24"/>
+                <w:szCs w:val="24"/>
+              </w:rPr>
               <w:t xml:space="preserve">${stt}</w:t>
             </w:r>
           </w:p>
         </w:tc>
         <w:tc>
           <w:tcPr>
-            <w:tcW w:w="1500" w:type="dxa"/>
-            <w:vAlign w:val="center"/>
-            <w:noWrap/>
-          </w:tcPr>
-          <w:p>
-            <w:pPr>
-              <w:jc w:val="center"/>
-            </w:pPr>
-            <w:r>
-              <w:rPr/>
+            <w:tcW w:w="2607.8740157480315" w:type="dxa"/>
+            <w:noWrap/>
+          </w:tcPr>
+          <w:p>
+            <w:pPr>
+              <w:spacing w:after="0"/>
+            </w:pPr>
+            <w:r>
+              <w:rPr>
+                <w:sz w:val="24"/>
+                <w:szCs w:val="24"/>
+              </w:rPr>
               <w:t xml:space="preserve">${ho_ten}</w:t>
             </w:r>
           </w:p>
         </w:tc>
         <w:tc>
           <w:tcPr>
-            <w:tcW w:w="1500" w:type="dxa"/>
-            <w:vAlign w:val="center"/>
-            <w:noWrap/>
-          </w:tcPr>
-          <w:p>
-            <w:pPr>
-              <w:jc w:val="center"/>
-            </w:pPr>
-            <w:r>
-              <w:rPr/>
+            <w:tcW w:w="1247.244094488189" w:type="dxa"/>
+            <w:noWrap/>
+          </w:tcPr>
+          <w:p>
+            <w:pPr>
+              <w:jc w:val="center"/>
+              <w:spacing w:after="0"/>
+            </w:pPr>
+            <w:r>
+              <w:rPr>
+                <w:sz w:val="24"/>
+                <w:szCs w:val="24"/>
+              </w:rPr>
               <w:t xml:space="preserve">${cap_bac}</w:t>
             </w:r>
           </w:p>
         </w:tc>
         <w:tc>
           <w:tcPr>
-            <w:tcW w:w="1500" w:type="dxa"/>
-            <w:vAlign w:val="center"/>
-            <w:noWrap/>
-          </w:tcPr>
-          <w:p>
-            <w:pPr>
-              <w:jc w:val="center"/>
-            </w:pPr>
-            <w:r>
-              <w:rPr/>
+            <w:tcW w:w="1190.551181102362" w:type="dxa"/>
+            <w:noWrap/>
+          </w:tcPr>
+          <w:p>
+            <w:pPr>
+              <w:jc w:val="center"/>
+              <w:spacing w:after="0"/>
+            </w:pPr>
+            <w:r>
+              <w:rPr>
+                <w:sz w:val="24"/>
+                <w:szCs w:val="24"/>
+              </w:rPr>
               <w:t xml:space="preserve">${nhap_ngu}</w:t>
             </w:r>
           </w:p>
         </w:tc>
         <w:tc>
           <w:tcPr>
-            <w:tcW w:w="1500" w:type="dxa"/>
-            <w:vAlign w:val="center"/>
-            <w:noWrap/>
-          </w:tcPr>
-          <w:p>
-            <w:pPr>
-              <w:jc w:val="center"/>
-            </w:pPr>
-            <w:r>
-              <w:rPr/>
+            <w:noWrap/>
+          </w:tcPr>
+          <w:p>
+            <w:pPr>
+              <w:jc w:val="center"/>
+              <w:spacing w:after="0"/>
+            </w:pPr>
+            <w:r>
+              <w:rPr>
+                <w:sz w:val="24"/>
+                <w:szCs w:val="24"/>
+              </w:rPr>
               <w:t xml:space="preserve">${tu_ngay}</w:t>
             </w:r>
           </w:p>
         </w:tc>
         <w:tc>
           <w:tcPr>
-            <w:tcW w:w="1500" w:type="dxa"/>
-            <w:vAlign w:val="center"/>
-            <w:noWrap/>
-          </w:tcPr>
-          <w:p>
-            <w:pPr>
-              <w:jc w:val="center"/>
-            </w:pPr>
-            <w:r>
-              <w:rPr/>
+            <w:noWrap/>
+          </w:tcPr>
+          <w:p>
+            <w:pPr>
+              <w:jc w:val="center"/>
+              <w:spacing w:after="0"/>
+            </w:pPr>
+            <w:r>
+              <w:rPr>
+                <w:sz w:val="24"/>
+                <w:szCs w:val="24"/>
+              </w:rPr>
               <w:t xml:space="preserve">${den_ngay}</w:t>
             </w:r>
           </w:p>
         </w:tc>
         <w:tc>
           <w:tcPr>
-            <w:tcW w:w="1500" w:type="dxa"/>
-            <w:vAlign w:val="center"/>
-            <w:noWrap/>
-          </w:tcPr>
-          <w:p>
-            <w:pPr>
-              <w:jc w:val="center"/>
-            </w:pPr>
-            <w:r>
-              <w:rPr/>
+            <w:noWrap/>
+          </w:tcPr>
+          <w:p>
+            <w:pPr>
+              <w:spacing w:after="0"/>
+            </w:pPr>
+            <w:r>
+              <w:rPr>
+                <w:sz w:val="24"/>
+                <w:szCs w:val="24"/>
+              </w:rPr>
               <w:t xml:space="preserve">${noi_nghi_phep}</w:t>
             </w:r>
           </w:p>
         </w:tc>
         <w:tc>
           <w:tcPr>
-            <w:tcW w:w="1500" w:type="dxa"/>
-            <w:vAlign w:val="center"/>
-            <w:noWrap/>
-          </w:tcPr>
-          <w:p>
-            <w:pPr>
-              <w:jc w:val="center"/>
-            </w:pPr>
-            <w:r>
-              <w:rPr/>
+            <w:noWrap/>
+          </w:tcPr>
+          <w:p>
+            <w:pPr>
+              <w:spacing w:after="0"/>
+            </w:pPr>
+            <w:r>
+              <w:rPr>
+                <w:sz w:val="24"/>
+                <w:szCs w:val="24"/>
+              </w:rPr>
               <w:t xml:space="preserve">${ly_do}</w:t>
             </w:r>
           </w:p>
         </w:tc>
       </w:tr>
     </w:tbl>
+    <w:p/>
     <w:p>
       <w:pPr>
-        <w:jc w:val="left"/>
+        <w:spacing w:after="160"/>
       </w:pPr>
       <w:r>
         <w:rPr>
-          <w:sz w:val="28"/>
-          <w:szCs w:val="28"/>
+          <w:i w:val="1"/>
+          <w:iCs w:val="1"/>
         </w:rPr>
         <w:t xml:space="preserve">* Tổng số: ${tong_so} đ/c, trong đó: Phép năm = ${so_phep_nam} đ/c, Phép đặc biệt = ${so_phep_dac_biet} đ/c.</w:t>
       </w:r>
     </w:p>
     <w:tbl>
       <w:tblGrid>
-        <w:gridCol w:w="7000" w:type="dxa"/>
-        <w:gridCol w:w="7000" w:type="dxa"/>
+        <w:gridCol w:w="7086.614173228347" w:type="dxa"/>
+        <w:gridCol w:w="7370.07874015748" w:type="dxa"/>
       </w:tblGrid>
       <w:tblPr>
         <w:tblW w:w="0" w:type="auto"/>
         <w:tblLayout w:type="autofit"/>
         <w:tblCellMar>
-          <w:top w:w="40" w:type="dxa"/>
-          <w:left w:w="40" w:type="dxa"/>
-          <w:right w:w="40" w:type="dxa"/>
-          <w:bottom w:w="40" w:type="dxa"/>
+          <w:top w:w="0" w:type="dxa"/>
+          <w:left w:w="0" w:type="dxa"/>
+          <w:right w:w="0" w:type="dxa"/>
+          <w:bottom w:w="0" w:type="dxa"/>
         </w:tblCellMar>
         <w:tblBorders>
-          <w:top w:val="single" w:sz="0" w:color="FFFFFF"/>
-          <w:left w:val="single" w:sz="0" w:color="FFFFFF"/>
-          <w:right w:val="single" w:sz="0" w:color="FFFFFF"/>
-          <w:bottom w:val="single" w:sz="0" w:color="FFFFFF"/>
-          <w:insideH w:val="single" w:sz="0" w:color="FFFFFF"/>
-          <w:insideV w:val="single" w:sz="0" w:color="FFFFFF"/>
+          <w:top w:val="single" w:sz="0"/>
+          <w:left w:val="single" w:sz="0"/>
+          <w:right w:val="single" w:sz="0"/>
+          <w:bottom w:val="single" w:sz="0"/>
+          <w:insideH w:val="single" w:sz="0"/>
+          <w:insideV w:val="single" w:sz="0"/>
         </w:tblBorders>
       </w:tblPr>
       <w:tr>
         <w:trPr/>
         <w:tc>
           <w:tcPr>
-            <w:tcW w:w="7000" w:type="dxa"/>
-            <w:noWrap/>
-          </w:tcPr>
-          <w:p>
-            <w:pPr>
-              <w:jc w:val="center"/>
+            <w:tcW w:w="7086.614173228347" w:type="dxa"/>
+            <w:noWrap/>
+          </w:tcPr>
+          <w:p>
+            <w:pPr>
+              <w:jc w:val="center"/>
+              <w:spacing w:after="0"/>
             </w:pPr>
             <w:r>
               <w:rPr>
@@ -540,6 +856,7 @@
               <w:rPr>
                 <w:b w:val="1"/>
                 <w:bCs w:val="1"/>
+                <w:u w:val="single"/>
               </w:rPr>
               <w:t xml:space="preserve">${nguoi_bao_cao}</w:t>
             </w:r>
@@ -547,12 +864,13 @@
         </w:tc>
         <w:tc>
           <w:tcPr>
-            <w:tcW w:w="7000" w:type="dxa"/>
-            <w:noWrap/>
-          </w:tcPr>
-          <w:p>
-            <w:pPr>
-              <w:jc w:val="center"/>
+            <w:tcW w:w="7370.07874015748" w:type="dxa"/>
+            <w:noWrap/>
+          </w:tcPr>
+          <w:p>
+            <w:pPr>
+              <w:jc w:val="center"/>
+              <w:spacing w:after="0"/>
             </w:pPr>
             <w:r>
               <w:rPr>
@@ -573,6 +891,7 @@
               <w:rPr>
                 <w:b w:val="1"/>
                 <w:bCs w:val="1"/>
+                <w:u w:val="single"/>
               </w:rPr>
               <w:t xml:space="preserve">${thu_truong}</w:t>
             </w:r>
@@ -581,8 +900,8 @@
       </w:tr>
     </w:tbl>
     <w:sectPr>
-      <w:pgSz w:orient="landscape" w:w="15840" w:h="12240"/>
-      <w:pgMar w:top="567" w:right="850" w:bottom="567" w:left="1135" w:header="720" w:footer="720" w:gutter="0"/>
+      <w:pgSz w:orient="landscape" w:w="16837.79527559055" w:h="11905.511811023622"/>
+      <w:pgMar w:top="566.9291338582676" w:right="680.3149606299213" w:bottom="566.9291338582676" w:left="850.3937007874015" w:header="720" w:footer="720" w:gutter="0"/>
       <w:cols w:num="1" w:space="720"/>
     </w:sectPr>
   </w:body>
@@ -604,8 +923,8 @@
       <w:rPr>
         <w:rFonts w:ascii="Times New Roman" w:hAnsi="Times New Roman" w:eastAsia="Arial" w:cs="Times New Roman"/>
         <w:color w:val="000000"/>
-        <w:sz w:val="24"/>
-        <w:szCs w:val="24"/>
+        <w:sz w:val="22"/>
+        <w:szCs w:val="22"/>
         <w:lang w:val="en-US"/>
       </w:rPr>
     </w:rPrDefault>

</xml_diff>